<commit_message>
Show expected loss in basis points; sharpen README for reviewers
- EL rates now render as basis points in the report (Sections 3 & 4) and
  carry an expected_loss_rate_bps column in expected_loss_inputs.csv, so
  low-loss segments read as "14 bps" instead of a misleading "0.00".
- README: add a "See it in 30 seconds" block linking the sample report and
  a model-input CSV, plus a quoted executive-summary preview.
- README: foreground validation.py (spread / outlier / vintage / peer-ratio)
  and governance.py (staleness / quality / coverage / peer-divergence) for a
  model validation & monitoring audience; describe what they actually do.
- README: add a "Related projects" section framing the three repos as one
  capability (data & benchmarks -> model development -> validation).
</commit_message>
<xml_diff>
--- a/output/Credit_Risk_Report_Q2_2026.docx
+++ b/output/Credit_Risk_Report_Q2_2026.docx
@@ -19,7 +19,7 @@
           <w:i/>
           <w:sz w:val="24"/>
         </w:rPr>
-        <w:t>Generated 2026-06-11T04:36:49+00:00 | Data as-of 2024-12-31–2026-02-28</w:t>
+        <w:t>Generated 2026-06-11T08:24:48+00:00 | Data as-of 2024-12-31–2026-02-28</w:t>
       </w:r>
     </w:p>
     <w:p>
@@ -213,7 +213,7 @@
           <w:rFonts w:ascii="Arial" w:hAnsi="Arial"/>
           <w:sz w:val="22"/>
         </w:rPr>
-        <w:t>Expected-loss rate = PD × LGD.</w:t>
+        <w:t>Expected-loss rate = PD × LGD, shown in basis points (bps); 1 bp = 0.01%, so 14 bps = 0.14%.</w:t>
       </w:r>
     </w:p>
     <w:p>
@@ -3881,7 +3881,7 @@
                 <w:b/>
                 <w:sz w:val="22"/>
               </w:rPr>
-              <w:t>el_rate_decimal</w:t>
+              <w:t>el_rate_bps</w:t>
             </w:r>
           </w:p>
         </w:tc>
@@ -4009,7 +4009,7 @@
                 <w:rFonts w:ascii="Arial" w:hAnsi="Arial"/>
                 <w:sz w:val="22"/>
               </w:rPr>
-              <w:t>0.00</w:t>
+              <w:t>46 bps</w:t>
             </w:r>
           </w:p>
         </w:tc>
@@ -4131,7 +4131,7 @@
                 <w:rFonts w:ascii="Arial" w:hAnsi="Arial"/>
                 <w:sz w:val="22"/>
               </w:rPr>
-              <w:t>0.01</w:t>
+              <w:t>77 bps</w:t>
             </w:r>
           </w:p>
         </w:tc>
@@ -4253,7 +4253,7 @@
                 <w:rFonts w:ascii="Arial" w:hAnsi="Arial"/>
                 <w:sz w:val="22"/>
               </w:rPr>
-              <w:t>0.01</w:t>
+              <w:t>117 bps</w:t>
             </w:r>
           </w:p>
         </w:tc>
@@ -4375,7 +4375,7 @@
                 <w:rFonts w:ascii="Arial" w:hAnsi="Arial"/>
                 <w:sz w:val="22"/>
               </w:rPr>
-              <w:t>0.01</w:t>
+              <w:t>63 bps</w:t>
             </w:r>
           </w:p>
         </w:tc>
@@ -4497,7 +4497,7 @@
                 <w:rFonts w:ascii="Arial" w:hAnsi="Arial"/>
                 <w:sz w:val="22"/>
               </w:rPr>
-              <w:t>0.00</w:t>
+              <w:t>24 bps</w:t>
             </w:r>
           </w:p>
         </w:tc>
@@ -4619,7 +4619,7 @@
                 <w:rFonts w:ascii="Arial" w:hAnsi="Arial"/>
                 <w:sz w:val="22"/>
               </w:rPr>
-              <w:t>0.00</w:t>
+              <w:t>14 bps</w:t>
             </w:r>
           </w:p>
         </w:tc>
@@ -4741,7 +4741,7 @@
                 <w:rFonts w:ascii="Arial" w:hAnsi="Arial"/>
                 <w:sz w:val="22"/>
               </w:rPr>
-              <w:t>0.01</w:t>
+              <w:t>57 bps</w:t>
             </w:r>
           </w:p>
         </w:tc>
@@ -4863,7 +4863,7 @@
                 <w:rFonts w:ascii="Arial" w:hAnsi="Arial"/>
                 <w:sz w:val="22"/>
               </w:rPr>
-              <w:t>0.01</w:t>
+              <w:t>120 bps</w:t>
             </w:r>
           </w:p>
         </w:tc>
@@ -4985,7 +4985,7 @@
                 <w:rFonts w:ascii="Arial" w:hAnsi="Arial"/>
                 <w:sz w:val="22"/>
               </w:rPr>
-              <w:t>0.00</w:t>
+              <w:t>5 bps</w:t>
             </w:r>
           </w:p>
         </w:tc>
@@ -5109,7 +5109,7 @@
                 <w:b/>
                 <w:sz w:val="22"/>
               </w:rPr>
-              <w:t>base_el_decimal</w:t>
+              <w:t>base_el_bps</w:t>
             </w:r>
           </w:p>
         </w:tc>
@@ -5160,7 +5160,7 @@
                 <w:b/>
                 <w:sz w:val="22"/>
               </w:rPr>
-              <w:t>stressed_el_decimal</w:t>
+              <w:t>stressed_el_bps</w:t>
             </w:r>
           </w:p>
         </w:tc>
@@ -5224,7 +5224,7 @@
                 <w:rFonts w:ascii="Arial" w:hAnsi="Arial"/>
                 <w:sz w:val="22"/>
               </w:rPr>
-              <w:t>0.00</w:t>
+              <w:t>46 bps</w:t>
             </w:r>
           </w:p>
         </w:tc>
@@ -5269,7 +5269,7 @@
                 <w:rFonts w:ascii="Arial" w:hAnsi="Arial"/>
                 <w:sz w:val="22"/>
               </w:rPr>
-              <w:t>0.01</w:t>
+              <w:t>125 bps</w:t>
             </w:r>
           </w:p>
         </w:tc>
@@ -5331,7 +5331,7 @@
                 <w:rFonts w:ascii="Arial" w:hAnsi="Arial"/>
                 <w:sz w:val="22"/>
               </w:rPr>
-              <w:t>0.01</w:t>
+              <w:t>77 bps</w:t>
             </w:r>
           </w:p>
         </w:tc>
@@ -5376,7 +5376,7 @@
                 <w:rFonts w:ascii="Arial" w:hAnsi="Arial"/>
                 <w:sz w:val="22"/>
               </w:rPr>
-              <w:t>0.01</w:t>
+              <w:t>139 bps</w:t>
             </w:r>
           </w:p>
         </w:tc>
@@ -5438,7 +5438,7 @@
                 <w:rFonts w:ascii="Arial" w:hAnsi="Arial"/>
                 <w:sz w:val="22"/>
               </w:rPr>
-              <w:t>0.01</w:t>
+              <w:t>117 bps</w:t>
             </w:r>
           </w:p>
         </w:tc>
@@ -5483,7 +5483,7 @@
                 <w:rFonts w:ascii="Arial" w:hAnsi="Arial"/>
                 <w:sz w:val="22"/>
               </w:rPr>
-              <w:t>0.03</w:t>
+              <w:t>301 bps</w:t>
             </w:r>
           </w:p>
         </w:tc>
@@ -5545,7 +5545,7 @@
                 <w:rFonts w:ascii="Arial" w:hAnsi="Arial"/>
                 <w:sz w:val="22"/>
               </w:rPr>
-              <w:t>0.01</w:t>
+              <w:t>63 bps</w:t>
             </w:r>
           </w:p>
         </w:tc>
@@ -5590,7 +5590,7 @@
                 <w:rFonts w:ascii="Arial" w:hAnsi="Arial"/>
                 <w:sz w:val="22"/>
               </w:rPr>
-              <w:t>0.02</w:t>
+              <w:t>210 bps</w:t>
             </w:r>
           </w:p>
         </w:tc>
@@ -5652,7 +5652,7 @@
                 <w:rFonts w:ascii="Arial" w:hAnsi="Arial"/>
                 <w:sz w:val="22"/>
               </w:rPr>
-              <w:t>0.00</w:t>
+              <w:t>24 bps</w:t>
             </w:r>
           </w:p>
         </w:tc>
@@ -5697,7 +5697,7 @@
                 <w:rFonts w:ascii="Arial" w:hAnsi="Arial"/>
                 <w:sz w:val="22"/>
               </w:rPr>
-              <w:t>0.00</w:t>
+              <w:t>43 bps</w:t>
             </w:r>
           </w:p>
         </w:tc>
@@ -5759,7 +5759,7 @@
                 <w:rFonts w:ascii="Arial" w:hAnsi="Arial"/>
                 <w:sz w:val="22"/>
               </w:rPr>
-              <w:t>0.00</w:t>
+              <w:t>14 bps</w:t>
             </w:r>
           </w:p>
         </w:tc>
@@ -5804,7 +5804,7 @@
                 <w:rFonts w:ascii="Arial" w:hAnsi="Arial"/>
                 <w:sz w:val="22"/>
               </w:rPr>
-              <w:t>0.00</w:t>
+              <w:t>25 bps</w:t>
             </w:r>
           </w:p>
         </w:tc>
@@ -5866,7 +5866,7 @@
                 <w:rFonts w:ascii="Arial" w:hAnsi="Arial"/>
                 <w:sz w:val="22"/>
               </w:rPr>
-              <w:t>0.01</w:t>
+              <w:t>57 bps</w:t>
             </w:r>
           </w:p>
         </w:tc>
@@ -5911,7 +5911,7 @@
                 <w:rFonts w:ascii="Arial" w:hAnsi="Arial"/>
                 <w:sz w:val="22"/>
               </w:rPr>
-              <w:t>0.01</w:t>
+              <w:t>102 bps</w:t>
             </w:r>
           </w:p>
         </w:tc>
@@ -5973,7 +5973,7 @@
                 <w:rFonts w:ascii="Arial" w:hAnsi="Arial"/>
                 <w:sz w:val="22"/>
               </w:rPr>
-              <w:t>0.01</w:t>
+              <w:t>120 bps</w:t>
             </w:r>
           </w:p>
         </w:tc>
@@ -6018,7 +6018,7 @@
                 <w:rFonts w:ascii="Arial" w:hAnsi="Arial"/>
                 <w:sz w:val="22"/>
               </w:rPr>
-              <w:t>0.02</w:t>
+              <w:t>215 bps</w:t>
             </w:r>
           </w:p>
         </w:tc>
@@ -6080,7 +6080,7 @@
                 <w:rFonts w:ascii="Arial" w:hAnsi="Arial"/>
                 <w:sz w:val="22"/>
               </w:rPr>
-              <w:t>0.00</w:t>
+              <w:t>5 bps</w:t>
             </w:r>
           </w:p>
         </w:tc>
@@ -6125,7 +6125,7 @@
                 <w:rFonts w:ascii="Arial" w:hAnsi="Arial"/>
                 <w:sz w:val="22"/>
               </w:rPr>
-              <w:t>0.00</w:t>
+              <w:t>8 bps</w:t>
             </w:r>
           </w:p>
         </w:tc>

</xml_diff>